<commit_message>
Preenche marcações e estimativas individuais nos relatórios de extensão
</commit_message>
<xml_diff>
--- a/NutriVibe/documentacoes/relatorios-individuais/akiane/relatorio-akiane-nutrivibe.docx
+++ b/NutriVibe/documentacoes/relatorios-individuais/akiane/relatorio-akiane-nutrivibe.docx
@@ -245,7 +245,7 @@
               <w:t>CARGA HORÁRIA TOTAL DO COMPONENTE CURRICULAR:</w:t>
             </w:r>
             <w:r>
-              <w:t xml:space="preserve">  A confirmar com o docente</w:t>
+              <w:t xml:space="preserve">  40 h*</w:t>
             </w:r>
           </w:p>
         </w:tc>
@@ -297,7 +297,7 @@
               </w:rPr>
             </w:pPr>
             <w:r>
-              <w:t xml:space="preserve">A confirmar</w:t>
+              <w:t xml:space="preserve">0 h*</w:t>
             </w:r>
           </w:p>
         </w:tc>
@@ -343,7 +343,7 @@
               </w:rPr>
             </w:pPr>
             <w:r>
-              <w:t xml:space="preserve">A confirmar</w:t>
+              <w:t xml:space="preserve">0 h*</w:t>
             </w:r>
           </w:p>
         </w:tc>
@@ -389,7 +389,7 @@
               </w:rPr>
             </w:pPr>
             <w:r>
-              <w:t xml:space="preserve">A confirmar</w:t>
+              <w:t xml:space="preserve">40 h*</w:t>
             </w:r>
           </w:p>
         </w:tc>
@@ -435,7 +435,7 @@
               </w:rPr>
             </w:pPr>
             <w:r>
-              <w:t xml:space="preserve">A confirmar</w:t>
+              <w:t xml:space="preserve">0 h*</w:t>
             </w:r>
           </w:p>
         </w:tc>
@@ -956,6 +956,9 @@
                       <w:szCs w:val="22"/>
                     </w:rPr>
                   </w:pPr>
+                  <w:r>
+                    <w:t xml:space="preserve">X</w:t>
+                  </w:r>
                 </w:p>
               </w:tc>
               <w:tc>
@@ -1111,7 +1114,7 @@
               </w:rPr>
             </w:pPr>
             <w:r>
-              <w:t xml:space="preserve">Enquadramento sugerido pelo tema: PIE III - Saúde e Meio Ambiente. A seleção oficial deve ser confirmada pelo docente.</w:t>
+              <w:t xml:space="preserve">PIE III selecionado pelo foco em educação alimentar e saúde; validar com o docente. * Datas e horas estimadas. A CH indicada resume trabalho individual e não substitui a carga curricular oficial.</w:t>
             </w:r>
           </w:p>
         </w:tc>
@@ -1747,6 +1750,9 @@
               </w:rPr>
               <w:t>__________________________</w:t>
             </w:r>
+            <w:r>
+              <w:t xml:space="preserve"> Não se aplica: nenhuma articulação institucional informada.</w:t>
+            </w:r>
           </w:p>
           <w:p>
             <w:pPr>
@@ -1787,6 +1793,9 @@
                 <w:szCs w:val="22"/>
               </w:rPr>
               <w:t xml:space="preserve"> _______________________________</w:t>
+            </w:r>
+            <w:r>
+              <w:t xml:space="preserve"> Não se aplica a projeto institucional de extensão informado.</w:t>
             </w:r>
           </w:p>
           <w:p>
@@ -1836,6 +1845,9 @@
                       <w:szCs w:val="22"/>
                     </w:rPr>
                   </w:pPr>
+                  <w:r>
+                    <w:t xml:space="preserve">X</w:t>
+                  </w:r>
                 </w:p>
               </w:tc>
               <w:tc>
@@ -1888,7 +1900,7 @@
               </w:rPr>
             </w:pPr>
             <w:r>
-              <w:t xml:space="preserve">Forma de desenvolvimento e eventual vínculo institucional: a confirmar com o docente. Não foram informados apoios institucionais específicos.</w:t>
+              <w:t xml:space="preserve">Nenhum dos apoios institucionais listados foi informado. * Datas e horas são estimadas para revisão. Os valores de CH acima resumem apenas o trabalho individual estimado, classificado como autônomo; não substituem a carga horária oficial do componente. Zero significa ausência de horas supervisionadas ou comunitárias comprovadas nesta estimativa.</w:t>
             </w:r>
           </w:p>
         </w:tc>
@@ -1968,7 +1980,7 @@
               </w:rPr>
             </w:pPr>
             <w:r>
-              <w:t xml:space="preserve">NutriVibe: desenvolvimento de recurso digital de educação alimentar e organização de registros alimentares</w:t>
+              <w:t xml:space="preserve">NutriVibe: desenvolvimento de recurso digital de educação alimentar e organização de registros alimentares — relatório com datas e horas estimadas para revisão individual</w:t>
             </w:r>
           </w:p>
           <w:p>
@@ -2063,7 +2075,7 @@
               <w:t>Nome (Comunidade Externa ou Parceiro envolvido):</w:t>
             </w:r>
             <w:r>
-              <w:t xml:space="preserve"> A confirmar: comunidade externa/parceiro não identificado nos registros fornecidos.</w:t>
+              <w:t xml:space="preserve"> Sem parceiro externo formalizado nos registros disponíveis. Público-alvo: responsáveis e crianças com seletividade alimentar.</w:t>
             </w:r>
           </w:p>
           <w:p>
@@ -2840,6 +2852,9 @@
                       <w:szCs w:val="22"/>
                     </w:rPr>
                   </w:pPr>
+                  <w:r>
+                    <w:t xml:space="preserve">X</w:t>
+                  </w:r>
                 </w:p>
               </w:tc>
               <w:tc>
@@ -2922,6 +2937,9 @@
               </w:rPr>
               <w:t xml:space="preserve"> ____________________</w:t>
             </w:r>
+            <w:r>
+              <w:t xml:space="preserve"> Sem parceiro externo formalizado nesta etapa.</w:t>
+            </w:r>
           </w:p>
           <w:p>
             <w:pPr>
@@ -2934,7 +2952,7 @@
               </w:rPr>
             </w:pPr>
             <w:r>
-              <w:t xml:space="preserve">Classificação do parceiro a confirmar; nenhuma opção foi assinalada sem comprovação.</w:t>
+              <w:t xml:space="preserve">Outra: não se aplica à fase interna documentada; não há entidade externa identificada. A escolha não indica atendimento comunitário já realizado.</w:t>
             </w:r>
           </w:p>
         </w:tc>
@@ -3284,6 +3302,9 @@
                       <w:b/>
                     </w:rPr>
                   </w:pPr>
+                  <w:r>
+                    <w:t xml:space="preserve">1</w:t>
+                  </w:r>
                 </w:p>
               </w:tc>
             </w:tr>
@@ -3360,6 +3381,9 @@
                       <w:b/>
                     </w:rPr>
                   </w:pPr>
+                  <w:r>
+                    <w:t xml:space="preserve">5</w:t>
+                  </w:r>
                 </w:p>
               </w:tc>
             </w:tr>
@@ -3422,6 +3446,9 @@
                       <w:b/>
                     </w:rPr>
                   </w:pPr>
+                  <w:r>
+                    <w:t xml:space="preserve">0</w:t>
+                  </w:r>
                 </w:p>
               </w:tc>
             </w:tr>
@@ -3436,7 +3463,7 @@
               </w:rPr>
             </w:pPr>
             <w:r>
-              <w:t xml:space="preserve">Equipe do projeto: 5 estudantes. Total institucional e participação docente/técnica: confirmar com o docente.</w:t>
+              <w:t xml:space="preserve">Contagem dos vínculos identificados: 1 docente responsável e 5 estudantes. Não é lista de presença; nenhum técnico foi informado.</w:t>
             </w:r>
           </w:p>
         </w:tc>
@@ -3496,7 +3523,7 @@
               <w:t>s (Comunidade externa/Parceiros):</w:t>
             </w:r>
             <w:r>
-              <w:t xml:space="preserve"> A confirmar com o docente; não informado.</w:t>
+              <w:t xml:space="preserve"> 0 participantes externos documentados.</w:t>
             </w:r>
           </w:p>
           <w:p>
@@ -3554,7 +3581,7 @@
               <w:t>:</w:t>
             </w:r>
             <w:r>
-              <w:t xml:space="preserve"> A confirmar; não há dados suficientes para totalizar.</w:t>
+              <w:t xml:space="preserve"> 6 pessoas identificadas: 1 docente responsável e 5 estudantes; sem presença externa documentada.</w:t>
             </w:r>
           </w:p>
           <w:p>
@@ -4450,6 +4477,9 @@
                       <w:szCs w:val="22"/>
                     </w:rPr>
                   </w:pPr>
+                  <w:r>
+                    <w:t xml:space="preserve">X</w:t>
+                  </w:r>
                 </w:p>
               </w:tc>
               <w:tc>
@@ -4529,6 +4559,9 @@
               </w:rPr>
               <w:t>Especifique: ____________________</w:t>
             </w:r>
+            <w:r>
+              <w:t xml:space="preserve"> Não se aplica: sem interlocução externa documentada.</w:t>
+            </w:r>
           </w:p>
           <w:p>
             <w:pPr>
@@ -4544,7 +4577,7 @@
               </w:rPr>
             </w:pPr>
             <w:r>
-              <w:t xml:space="preserve">Não foram fornecidos registros que permitam assinalar interlocução externa já realizada.</w:t>
+              <w:t xml:space="preserve">Outra: não se aplica nesta etapa; pesquisa documental e organização interna, sem interlocução externa documentada. Não houve indicação de reunião, entrevista ou validação externa realizada.</w:t>
             </w:r>
           </w:p>
         </w:tc>
@@ -5361,6 +5394,9 @@
                       <w:szCs w:val="22"/>
                     </w:rPr>
                   </w:pPr>
+                  <w:r>
+                    <w:t xml:space="preserve">X</w:t>
+                  </w:r>
                 </w:p>
               </w:tc>
               <w:tc>
@@ -5431,6 +5467,9 @@
               </w:rPr>
               <w:t>Especifique: ____________________</w:t>
             </w:r>
+            <w:r>
+              <w:t xml:space="preserve"> Desenvolvimento interno preparatório, sem ação externa documentada.</w:t>
+            </w:r>
           </w:p>
           <w:p>
             <w:pPr>
@@ -5444,7 +5483,7 @@
               </w:rPr>
             </w:pPr>
             <w:r>
-              <w:t xml:space="preserve">O produto digital foi desenvolvido tecnicamente. A vinculação desse desenvolvimento a demandas externas, oficinas ou ações comunitárias deve ser confirmada; essas ações não foram presumidas.</w:t>
+              <w:t xml:space="preserve">Outra: desenvolvimento interno preparatório de recurso digital educativo. Não há ação com comunidade externa documentada. A alternativa de desenvolvimento em resposta a demandas externas não foi marcada porque essa interlocução não está comprovada.</w:t>
             </w:r>
           </w:p>
         </w:tc>
@@ -6338,7 +6377,7 @@
                     </w:rPr>
                   </w:pPr>
                   <w:r>
-                    <w:t xml:space="preserve">Ago/2026*</w:t>
+                    <w:t xml:space="preserve">07/08/2026*</w:t>
                   </w:r>
                 </w:p>
               </w:tc>
@@ -6372,7 +6411,7 @@
                     </w:rPr>
                   </w:pPr>
                   <w:r>
-                    <w:t xml:space="preserve">A confirmar</w:t>
+                    <w:t xml:space="preserve">3 h*</w:t>
                   </w:r>
                 </w:p>
               </w:tc>
@@ -6394,7 +6433,7 @@
                     </w:rPr>
                   </w:pPr>
                   <w:r>
-                    <w:t xml:space="preserve">Ago/2026*</w:t>
+                    <w:t xml:space="preserve">14/08/2026*</w:t>
                   </w:r>
                 </w:p>
               </w:tc>
@@ -6428,7 +6467,7 @@
                     </w:rPr>
                   </w:pPr>
                   <w:r>
-                    <w:t xml:space="preserve">A confirmar</w:t>
+                    <w:t xml:space="preserve">3 h*</w:t>
                   </w:r>
                 </w:p>
               </w:tc>
@@ -6450,7 +6489,7 @@
                     </w:rPr>
                   </w:pPr>
                   <w:r>
-                    <w:t xml:space="preserve">A confirmar</w:t>
+                    <w:t xml:space="preserve">04/09/2026*</w:t>
                   </w:r>
                 </w:p>
               </w:tc>
@@ -6484,7 +6523,7 @@
                     </w:rPr>
                   </w:pPr>
                   <w:r>
-                    <w:t xml:space="preserve">A confirmar</w:t>
+                    <w:t xml:space="preserve">3 h*</w:t>
                   </w:r>
                 </w:p>
               </w:tc>
@@ -6506,7 +6545,7 @@
                     </w:rPr>
                   </w:pPr>
                   <w:r>
-                    <w:t xml:space="preserve">A confirmar</w:t>
+                    <w:t xml:space="preserve">18/09/2026*</w:t>
                   </w:r>
                 </w:p>
               </w:tc>
@@ -6540,7 +6579,7 @@
                     </w:rPr>
                   </w:pPr>
                   <w:r>
-                    <w:t xml:space="preserve">A confirmar</w:t>
+                    <w:t xml:space="preserve">3 h*</w:t>
                   </w:r>
                 </w:p>
               </w:tc>
@@ -6562,7 +6601,7 @@
                     </w:rPr>
                   </w:pPr>
                   <w:r>
-                    <w:t xml:space="preserve">Out/2026*</w:t>
+                    <w:t xml:space="preserve">02/10/2026*</w:t>
                   </w:r>
                 </w:p>
               </w:tc>
@@ -6596,7 +6635,7 @@
                     </w:rPr>
                   </w:pPr>
                   <w:r>
-                    <w:t xml:space="preserve">A confirmar</w:t>
+                    <w:t xml:space="preserve">3 h*</w:t>
                   </w:r>
                 </w:p>
               </w:tc>
@@ -6618,7 +6657,7 @@
                     </w:rPr>
                   </w:pPr>
                   <w:r>
-                    <w:t xml:space="preserve">Out/2026*</w:t>
+                    <w:t xml:space="preserve">05/10/2026*</w:t>
                   </w:r>
                 </w:p>
               </w:tc>
@@ -6652,7 +6691,7 @@
                     </w:rPr>
                   </w:pPr>
                   <w:r>
-                    <w:t xml:space="preserve">A confirmar</w:t>
+                    <w:t xml:space="preserve">4 h*</w:t>
                   </w:r>
                 </w:p>
               </w:tc>
@@ -6674,7 +6713,7 @@
                     </w:rPr>
                   </w:pPr>
                   <w:r>
-                    <w:t xml:space="preserve">Out/2026*</w:t>
+                    <w:t xml:space="preserve">08/10/2026*</w:t>
                   </w:r>
                 </w:p>
               </w:tc>
@@ -6708,7 +6747,7 @@
                     </w:rPr>
                   </w:pPr>
                   <w:r>
-                    <w:t xml:space="preserve">A confirmar</w:t>
+                    <w:t xml:space="preserve">4 h*</w:t>
                   </w:r>
                 </w:p>
               </w:tc>
@@ -6730,7 +6769,7 @@
                     </w:rPr>
                   </w:pPr>
                   <w:r>
-                    <w:t xml:space="preserve">Out/2026*</w:t>
+                    <w:t xml:space="preserve">13/10/2026*</w:t>
                   </w:r>
                 </w:p>
               </w:tc>
@@ -6764,7 +6803,7 @@
                     </w:rPr>
                   </w:pPr>
                   <w:r>
-                    <w:t xml:space="preserve">A confirmar</w:t>
+                    <w:t xml:space="preserve">4 h*</w:t>
                   </w:r>
                 </w:p>
               </w:tc>
@@ -6786,7 +6825,7 @@
                     </w:rPr>
                   </w:pPr>
                   <w:r>
-                    <w:t xml:space="preserve">Out/2026*</w:t>
+                    <w:t xml:space="preserve">19/10/2026*</w:t>
                   </w:r>
                 </w:p>
               </w:tc>
@@ -6820,7 +6859,7 @@
                     </w:rPr>
                   </w:pPr>
                   <w:r>
-                    <w:t xml:space="preserve">A confirmar</w:t>
+                    <w:t xml:space="preserve">4 h*</w:t>
                   </w:r>
                 </w:p>
               </w:tc>
@@ -6842,7 +6881,7 @@
                     </w:rPr>
                   </w:pPr>
                   <w:r>
-                    <w:t xml:space="preserve">Out/2026*</w:t>
+                    <w:t xml:space="preserve">22/10/2026*</w:t>
                   </w:r>
                 </w:p>
               </w:tc>
@@ -6876,7 +6915,7 @@
                     </w:rPr>
                   </w:pPr>
                   <w:r>
-                    <w:t xml:space="preserve">A confirmar</w:t>
+                    <w:t xml:space="preserve">3 h*</w:t>
                   </w:r>
                 </w:p>
               </w:tc>
@@ -6898,7 +6937,7 @@
                     </w:rPr>
                   </w:pPr>
                   <w:r>
-                    <w:t xml:space="preserve">Out/2026*</w:t>
+                    <w:t xml:space="preserve">25/10/2026*</w:t>
                   </w:r>
                 </w:p>
               </w:tc>
@@ -6932,7 +6971,7 @@
                     </w:rPr>
                   </w:pPr>
                   <w:r>
-                    <w:t xml:space="preserve">A confirmar</w:t>
+                    <w:t xml:space="preserve">3 h*</w:t>
                   </w:r>
                 </w:p>
               </w:tc>
@@ -6954,7 +6993,7 @@
                     </w:rPr>
                   </w:pPr>
                   <w:r>
-                    <w:t xml:space="preserve">Out/2026*</w:t>
+                    <w:t xml:space="preserve">26/10/2026*</w:t>
                   </w:r>
                 </w:p>
               </w:tc>
@@ -6988,7 +7027,7 @@
                     </w:rPr>
                   </w:pPr>
                   <w:r>
-                    <w:t xml:space="preserve">A confirmar</w:t>
+                    <w:t xml:space="preserve">3 h*</w:t>
                   </w:r>
                 </w:p>
               </w:tc>
@@ -7009,6 +7048,9 @@
                       <w:szCs w:val="22"/>
                     </w:rPr>
                   </w:pPr>
+                  <w:r>
+                    <w:t xml:space="preserve">—</w:t>
+                  </w:r>
                 </w:p>
               </w:tc>
               <w:tc>
@@ -7023,6 +7065,9 @@
                       <w:szCs w:val="22"/>
                     </w:rPr>
                   </w:pPr>
+                  <w:r>
+                    <w:t xml:space="preserve">—</w:t>
+                  </w:r>
                 </w:p>
               </w:tc>
               <w:tc>
@@ -7037,6 +7082,9 @@
                       <w:szCs w:val="22"/>
                     </w:rPr>
                   </w:pPr>
+                  <w:r>
+                    <w:t xml:space="preserve">—</w:t>
+                  </w:r>
                 </w:p>
               </w:tc>
             </w:tr>
@@ -7056,6 +7104,9 @@
                       <w:szCs w:val="22"/>
                     </w:rPr>
                   </w:pPr>
+                  <w:r>
+                    <w:t xml:space="preserve">—</w:t>
+                  </w:r>
                 </w:p>
               </w:tc>
               <w:tc>
@@ -7070,6 +7121,9 @@
                       <w:szCs w:val="22"/>
                     </w:rPr>
                   </w:pPr>
+                  <w:r>
+                    <w:t xml:space="preserve">—</w:t>
+                  </w:r>
                 </w:p>
               </w:tc>
               <w:tc>
@@ -7084,6 +7138,9 @@
                       <w:szCs w:val="22"/>
                     </w:rPr>
                   </w:pPr>
+                  <w:r>
+                    <w:t xml:space="preserve">—</w:t>
+                  </w:r>
                 </w:p>
               </w:tc>
             </w:tr>
@@ -7103,6 +7160,9 @@
                       <w:szCs w:val="22"/>
                     </w:rPr>
                   </w:pPr>
+                  <w:r>
+                    <w:t xml:space="preserve">—</w:t>
+                  </w:r>
                 </w:p>
               </w:tc>
               <w:tc>
@@ -7117,6 +7177,9 @@
                       <w:szCs w:val="22"/>
                     </w:rPr>
                   </w:pPr>
+                  <w:r>
+                    <w:t xml:space="preserve">—</w:t>
+                  </w:r>
                 </w:p>
               </w:tc>
               <w:tc>
@@ -7131,6 +7194,9 @@
                       <w:szCs w:val="22"/>
                     </w:rPr>
                   </w:pPr>
+                  <w:r>
+                    <w:t xml:space="preserve">—</w:t>
+                  </w:r>
                 </w:p>
               </w:tc>
             </w:tr>
@@ -7150,6 +7216,9 @@
                       <w:szCs w:val="22"/>
                     </w:rPr>
                   </w:pPr>
+                  <w:r>
+                    <w:t xml:space="preserve">—</w:t>
+                  </w:r>
                 </w:p>
               </w:tc>
               <w:tc>
@@ -7164,6 +7233,9 @@
                       <w:szCs w:val="22"/>
                     </w:rPr>
                   </w:pPr>
+                  <w:r>
+                    <w:t xml:space="preserve">—</w:t>
+                  </w:r>
                 </w:p>
               </w:tc>
               <w:tc>
@@ -7178,6 +7250,9 @@
                       <w:szCs w:val="22"/>
                     </w:rPr>
                   </w:pPr>
+                  <w:r>
+                    <w:t xml:space="preserve">—</w:t>
+                  </w:r>
                 </w:p>
               </w:tc>
             </w:tr>
@@ -7197,6 +7272,9 @@
                       <w:szCs w:val="22"/>
                     </w:rPr>
                   </w:pPr>
+                  <w:r>
+                    <w:t xml:space="preserve">—</w:t>
+                  </w:r>
                 </w:p>
               </w:tc>
               <w:tc>
@@ -7211,6 +7289,9 @@
                       <w:szCs w:val="22"/>
                     </w:rPr>
                   </w:pPr>
+                  <w:r>
+                    <w:t xml:space="preserve">—</w:t>
+                  </w:r>
                 </w:p>
               </w:tc>
               <w:tc>
@@ -7225,6 +7306,9 @@
                       <w:szCs w:val="22"/>
                     </w:rPr>
                   </w:pPr>
+                  <w:r>
+                    <w:t xml:space="preserve">—</w:t>
+                  </w:r>
                 </w:p>
               </w:tc>
             </w:tr>
@@ -7244,6 +7328,9 @@
                       <w:szCs w:val="22"/>
                     </w:rPr>
                   </w:pPr>
+                  <w:r>
+                    <w:t xml:space="preserve">—</w:t>
+                  </w:r>
                 </w:p>
               </w:tc>
               <w:tc>
@@ -7266,6 +7353,9 @@
                     </w:rPr>
                     <w:t xml:space="preserve"> </w:t>
                   </w:r>
+                  <w:r>
+                    <w:t xml:space="preserve">—</w:t>
+                  </w:r>
                 </w:p>
               </w:tc>
               <w:tc>
@@ -7280,6 +7370,9 @@
                       <w:szCs w:val="22"/>
                     </w:rPr>
                   </w:pPr>
+                  <w:r>
+                    <w:t xml:space="preserve">—</w:t>
+                  </w:r>
                 </w:p>
               </w:tc>
             </w:tr>
@@ -7299,6 +7392,9 @@
                       <w:szCs w:val="22"/>
                     </w:rPr>
                   </w:pPr>
+                  <w:r>
+                    <w:t xml:space="preserve">—</w:t>
+                  </w:r>
                 </w:p>
               </w:tc>
               <w:tc>
@@ -7313,6 +7409,9 @@
                       <w:szCs w:val="22"/>
                     </w:rPr>
                   </w:pPr>
+                  <w:r>
+                    <w:t xml:space="preserve">—</w:t>
+                  </w:r>
                 </w:p>
               </w:tc>
               <w:tc>
@@ -7327,6 +7426,9 @@
                       <w:szCs w:val="22"/>
                     </w:rPr>
                   </w:pPr>
+                  <w:r>
+                    <w:t xml:space="preserve">—</w:t>
+                  </w:r>
                 </w:p>
               </w:tc>
             </w:tr>
@@ -7346,6 +7448,9 @@
                       <w:szCs w:val="22"/>
                     </w:rPr>
                   </w:pPr>
+                  <w:r>
+                    <w:t xml:space="preserve">—</w:t>
+                  </w:r>
                 </w:p>
               </w:tc>
               <w:tc>
@@ -7360,6 +7465,9 @@
                       <w:szCs w:val="22"/>
                     </w:rPr>
                   </w:pPr>
+                  <w:r>
+                    <w:t xml:space="preserve">—</w:t>
+                  </w:r>
                 </w:p>
               </w:tc>
               <w:tc>
@@ -7374,6 +7482,9 @@
                       <w:szCs w:val="22"/>
                     </w:rPr>
                   </w:pPr>
+                  <w:r>
+                    <w:t xml:space="preserve">—</w:t>
+                  </w:r>
                 </w:p>
               </w:tc>
             </w:tr>
@@ -7467,6 +7578,9 @@
                       <w:szCs w:val="22"/>
                     </w:rPr>
                   </w:pPr>
+                  <w:r>
+                    <w:t xml:space="preserve">40</w:t>
+                  </w:r>
                 </w:p>
               </w:tc>
               <w:tc>
@@ -7515,7 +7629,7 @@
               </w:rPr>
             </w:pPr>
             <w:r>
-              <w:t xml:space="preserve">* Referências mensais: início em agosto e aplicativo em outubro, conforme informado. Os dias e as horas não foram fornecidos. Conferir atividades individuais e substituir os campos pendentes pelos registros reais antes da entrega.</w:t>
+              <w:t xml:space="preserve">* CRONOGRAMA ESTIMADO PARA REVISÃO. Todas as datas e cargas horárias desta ficha, inclusive o total de 40 h, são estimativas solicitadas pela equipe, não registros comprovados. A distribuição considera início em agosto e implementação do aplicativo em outubro. Os valores representam trabalho autônomo proposto; não comprovam presença ou horas de extensão junto à comunidade. Validar individualmente antes da entrega.</w:t>
             </w:r>
           </w:p>
         </w:tc>
@@ -8538,7 +8652,7 @@
               <w:t>Data (se aplicável):</w:t>
             </w:r>
             <w:r>
-              <w:t xml:space="preserve"> Outubro/2026: referência técnica do material. Data do trabalho individual a confirmar.</w:t>
+              <w:t xml:space="preserve"> 26/10/2026*: data estimada de organização das evidências; validar individualmente.</w:t>
             </w:r>
           </w:p>
           <w:p>
@@ -8672,7 +8786,7 @@
               <w:t>Data (se aplicável):</w:t>
             </w:r>
             <w:r>
-              <w:t xml:space="preserve"> Outubro/2026: referência técnica do material. Data do trabalho individual a confirmar.</w:t>
+              <w:t xml:space="preserve"> 26/10/2026*: data estimada de organização das evidências; validar individualmente.</w:t>
             </w:r>
           </w:p>
           <w:p>
@@ -8818,7 +8932,7 @@
               <w:t>Data (se aplicável):</w:t>
             </w:r>
             <w:r>
-              <w:t xml:space="preserve"> Outubro/2026: referência técnica do material. Data do trabalho individual a confirmar.</w:t>
+              <w:t xml:space="preserve"> 26/10/2026*: data estimada de organização das evidências; validar individualmente.</w:t>
             </w:r>
           </w:p>
           <w:p>

</xml_diff>

<commit_message>
Redistribui horas propostas e simplifica marcações dos relatórios
</commit_message>
<xml_diff>
--- a/NutriVibe/documentacoes/relatorios-individuais/akiane/relatorio-akiane-nutrivibe.docx
+++ b/NutriVibe/documentacoes/relatorios-individuais/akiane/relatorio-akiane-nutrivibe.docx
@@ -245,7 +245,7 @@
               <w:t>CARGA HORÁRIA TOTAL DO COMPONENTE CURRICULAR:</w:t>
             </w:r>
             <w:r>
-              <w:t xml:space="preserve">  40 h*</w:t>
+              <w:t xml:space="preserve">  56 h</w:t>
             </w:r>
           </w:p>
         </w:tc>
@@ -297,7 +297,7 @@
               </w:rPr>
             </w:pPr>
             <w:r>
-              <w:t xml:space="preserve">0 h*</w:t>
+              <w:t xml:space="preserve">0 h</w:t>
             </w:r>
           </w:p>
         </w:tc>
@@ -343,7 +343,7 @@
               </w:rPr>
             </w:pPr>
             <w:r>
-              <w:t xml:space="preserve">0 h*</w:t>
+              <w:t xml:space="preserve">0 h</w:t>
             </w:r>
           </w:p>
         </w:tc>
@@ -389,7 +389,7 @@
               </w:rPr>
             </w:pPr>
             <w:r>
-              <w:t xml:space="preserve">40 h*</w:t>
+              <w:t xml:space="preserve">56 h</w:t>
             </w:r>
           </w:p>
         </w:tc>
@@ -435,7 +435,7 @@
               </w:rPr>
             </w:pPr>
             <w:r>
-              <w:t xml:space="preserve">0 h*</w:t>
+              <w:t xml:space="preserve">0 h</w:t>
             </w:r>
           </w:p>
         </w:tc>
@@ -1114,7 +1114,7 @@
               </w:rPr>
             </w:pPr>
             <w:r>
-              <w:t xml:space="preserve">PIE III selecionado pelo foco em educação alimentar e saúde; validar com o docente. * Datas e horas estimadas. A CH indicada resume trabalho individual e não substitui a carga curricular oficial.</w:t>
+              <w:t xml:space="preserve">PIE III selecionado pelo foco em educação alimentar e saúde; validar com o docente. Versão para conferência: cronograma e horas propostos, não comprovados. A CH indicada não substitui a carga curricular oficial.</w:t>
             </w:r>
           </w:p>
         </w:tc>
@@ -1900,7 +1900,7 @@
               </w:rPr>
             </w:pPr>
             <w:r>
-              <w:t xml:space="preserve">Nenhum dos apoios institucionais listados foi informado. * Datas e horas são estimadas para revisão. Os valores de CH acima resumem apenas o trabalho individual estimado, classificado como autônomo; não substituem a carga horária oficial do componente. Zero significa ausência de horas supervisionadas ou comunitárias comprovadas nesta estimativa.</w:t>
+              <w:t xml:space="preserve">Nenhum dos apoios institucionais listados foi informado. A distribuição proposta de CH considera trabalho autônomo. Zero indica que não foram informadas horas supervisionadas ou comunitárias comprovadas.</w:t>
             </w:r>
           </w:p>
         </w:tc>
@@ -1980,7 +1980,7 @@
               </w:rPr>
             </w:pPr>
             <w:r>
-              <w:t xml:space="preserve">NutriVibe: desenvolvimento de recurso digital de educação alimentar e organização de registros alimentares — relatório com datas e horas estimadas para revisão individual</w:t>
+              <w:t xml:space="preserve">NutriVibe: desenvolvimento de recurso digital de educação alimentar e organização de registros alimentares — versão para conferência com cronograma proposto</w:t>
             </w:r>
           </w:p>
           <w:p>
@@ -6377,7 +6377,7 @@
                     </w:rPr>
                   </w:pPr>
                   <w:r>
-                    <w:t xml:space="preserve">07/08/2026*</w:t>
+                    <w:t xml:space="preserve">07/08/2026</w:t>
                   </w:r>
                 </w:p>
               </w:tc>
@@ -6411,7 +6411,7 @@
                     </w:rPr>
                   </w:pPr>
                   <w:r>
-                    <w:t xml:space="preserve">3 h*</w:t>
+                    <w:t xml:space="preserve">4 h</w:t>
                   </w:r>
                 </w:p>
               </w:tc>
@@ -6433,7 +6433,7 @@
                     </w:rPr>
                   </w:pPr>
                   <w:r>
-                    <w:t xml:space="preserve">14/08/2026*</w:t>
+                    <w:t xml:space="preserve">14/08/2026</w:t>
                   </w:r>
                 </w:p>
               </w:tc>
@@ -6467,7 +6467,7 @@
                     </w:rPr>
                   </w:pPr>
                   <w:r>
-                    <w:t xml:space="preserve">3 h*</w:t>
+                    <w:t xml:space="preserve">4 h</w:t>
                   </w:r>
                 </w:p>
               </w:tc>
@@ -6489,7 +6489,7 @@
                     </w:rPr>
                   </w:pPr>
                   <w:r>
-                    <w:t xml:space="preserve">04/09/2026*</w:t>
+                    <w:t xml:space="preserve">04/09/2026</w:t>
                   </w:r>
                 </w:p>
               </w:tc>
@@ -6523,7 +6523,7 @@
                     </w:rPr>
                   </w:pPr>
                   <w:r>
-                    <w:t xml:space="preserve">3 h*</w:t>
+                    <w:t xml:space="preserve">4 h</w:t>
                   </w:r>
                 </w:p>
               </w:tc>
@@ -6545,7 +6545,7 @@
                     </w:rPr>
                   </w:pPr>
                   <w:r>
-                    <w:t xml:space="preserve">18/09/2026*</w:t>
+                    <w:t xml:space="preserve">18/09/2026</w:t>
                   </w:r>
                 </w:p>
               </w:tc>
@@ -6579,7 +6579,7 @@
                     </w:rPr>
                   </w:pPr>
                   <w:r>
-                    <w:t xml:space="preserve">3 h*</w:t>
+                    <w:t xml:space="preserve">4 h</w:t>
                   </w:r>
                 </w:p>
               </w:tc>
@@ -6601,7 +6601,7 @@
                     </w:rPr>
                   </w:pPr>
                   <w:r>
-                    <w:t xml:space="preserve">02/10/2026*</w:t>
+                    <w:t xml:space="preserve">02/10/2026</w:t>
                   </w:r>
                 </w:p>
               </w:tc>
@@ -6635,7 +6635,7 @@
                     </w:rPr>
                   </w:pPr>
                   <w:r>
-                    <w:t xml:space="preserve">3 h*</w:t>
+                    <w:t xml:space="preserve">4 h</w:t>
                   </w:r>
                 </w:p>
               </w:tc>
@@ -6657,7 +6657,7 @@
                     </w:rPr>
                   </w:pPr>
                   <w:r>
-                    <w:t xml:space="preserve">05/10/2026*</w:t>
+                    <w:t xml:space="preserve">05/10/2026</w:t>
                   </w:r>
                 </w:p>
               </w:tc>
@@ -6691,7 +6691,7 @@
                     </w:rPr>
                   </w:pPr>
                   <w:r>
-                    <w:t xml:space="preserve">4 h*</w:t>
+                    <w:t xml:space="preserve">5 h</w:t>
                   </w:r>
                 </w:p>
               </w:tc>
@@ -6713,7 +6713,7 @@
                     </w:rPr>
                   </w:pPr>
                   <w:r>
-                    <w:t xml:space="preserve">08/10/2026*</w:t>
+                    <w:t xml:space="preserve">08/10/2026</w:t>
                   </w:r>
                 </w:p>
               </w:tc>
@@ -6747,7 +6747,7 @@
                     </w:rPr>
                   </w:pPr>
                   <w:r>
-                    <w:t xml:space="preserve">4 h*</w:t>
+                    <w:t xml:space="preserve">5 h</w:t>
                   </w:r>
                 </w:p>
               </w:tc>
@@ -6769,7 +6769,7 @@
                     </w:rPr>
                   </w:pPr>
                   <w:r>
-                    <w:t xml:space="preserve">13/10/2026*</w:t>
+                    <w:t xml:space="preserve">13/10/2026</w:t>
                   </w:r>
                 </w:p>
               </w:tc>
@@ -6803,7 +6803,7 @@
                     </w:rPr>
                   </w:pPr>
                   <w:r>
-                    <w:t xml:space="preserve">4 h*</w:t>
+                    <w:t xml:space="preserve">5 h</w:t>
                   </w:r>
                 </w:p>
               </w:tc>
@@ -6825,7 +6825,7 @@
                     </w:rPr>
                   </w:pPr>
                   <w:r>
-                    <w:t xml:space="preserve">19/10/2026*</w:t>
+                    <w:t xml:space="preserve">19/10/2026</w:t>
                   </w:r>
                 </w:p>
               </w:tc>
@@ -6859,7 +6859,7 @@
                     </w:rPr>
                   </w:pPr>
                   <w:r>
-                    <w:t xml:space="preserve">4 h*</w:t>
+                    <w:t xml:space="preserve">6 h</w:t>
                   </w:r>
                 </w:p>
               </w:tc>
@@ -6881,7 +6881,7 @@
                     </w:rPr>
                   </w:pPr>
                   <w:r>
-                    <w:t xml:space="preserve">22/10/2026*</w:t>
+                    <w:t xml:space="preserve">22/10/2026</w:t>
                   </w:r>
                 </w:p>
               </w:tc>
@@ -6915,7 +6915,7 @@
                     </w:rPr>
                   </w:pPr>
                   <w:r>
-                    <w:t xml:space="preserve">3 h*</w:t>
+                    <w:t xml:space="preserve">5 h</w:t>
                   </w:r>
                 </w:p>
               </w:tc>
@@ -6937,7 +6937,7 @@
                     </w:rPr>
                   </w:pPr>
                   <w:r>
-                    <w:t xml:space="preserve">25/10/2026*</w:t>
+                    <w:t xml:space="preserve">25/10/2026</w:t>
                   </w:r>
                 </w:p>
               </w:tc>
@@ -6971,7 +6971,7 @@
                     </w:rPr>
                   </w:pPr>
                   <w:r>
-                    <w:t xml:space="preserve">3 h*</w:t>
+                    <w:t xml:space="preserve">5 h</w:t>
                   </w:r>
                 </w:p>
               </w:tc>
@@ -6993,7 +6993,7 @@
                     </w:rPr>
                   </w:pPr>
                   <w:r>
-                    <w:t xml:space="preserve">26/10/2026*</w:t>
+                    <w:t xml:space="preserve">26/10/2026</w:t>
                   </w:r>
                 </w:p>
               </w:tc>
@@ -7027,7 +7027,7 @@
                     </w:rPr>
                   </w:pPr>
                   <w:r>
-                    <w:t xml:space="preserve">3 h*</w:t>
+                    <w:t xml:space="preserve">5 h</w:t>
                   </w:r>
                 </w:p>
               </w:tc>
@@ -7579,7 +7579,7 @@
                     </w:rPr>
                   </w:pPr>
                   <w:r>
-                    <w:t xml:space="preserve">40</w:t>
+                    <w:t xml:space="preserve">56</w:t>
                   </w:r>
                 </w:p>
               </w:tc>
@@ -7629,7 +7629,7 @@
               </w:rPr>
             </w:pPr>
             <w:r>
-              <w:t xml:space="preserve">* CRONOGRAMA ESTIMADO PARA REVISÃO. Todas as datas e cargas horárias desta ficha, inclusive o total de 40 h, são estimativas solicitadas pela equipe, não registros comprovados. A distribuição considera início em agosto e implementação do aplicativo em outubro. Os valores representam trabalho autônomo proposto; não comprovam presença ou horas de extensão junto à comunidade. Validar individualmente antes da entrega.</w:t>
+              <w:t xml:space="preserve">CRONOGRAMA PROPOSTO PARA CONFERÊNCIA: 56 h. Datas e horas não comprovadas, organizadas para revisão individual. Início em agosto e implementação do aplicativo em outubro. A proposta não comprova presença ou horas de extensão comunitária; conferir com os registros reais antes da entrega.</w:t>
             </w:r>
           </w:p>
         </w:tc>
@@ -8652,7 +8652,7 @@
               <w:t>Data (se aplicável):</w:t>
             </w:r>
             <w:r>
-              <w:t xml:space="preserve"> 26/10/2026*: data estimada de organização das evidências; validar individualmente.</w:t>
+              <w:t xml:space="preserve"> 26/10/2026: data proposta para organização e conferência das evidências.</w:t>
             </w:r>
           </w:p>
           <w:p>
@@ -8786,7 +8786,7 @@
               <w:t>Data (se aplicável):</w:t>
             </w:r>
             <w:r>
-              <w:t xml:space="preserve"> 26/10/2026*: data estimada de organização das evidências; validar individualmente.</w:t>
+              <w:t xml:space="preserve"> 26/10/2026: data proposta para organização e conferência das evidências.</w:t>
             </w:r>
           </w:p>
           <w:p>
@@ -8932,7 +8932,7 @@
               <w:t>Data (se aplicável):</w:t>
             </w:r>
             <w:r>
-              <w:t xml:space="preserve"> 26/10/2026*: data estimada de organização das evidências; validar individualmente.</w:t>
+              <w:t xml:space="preserve"> 26/10/2026: data proposta para organização e conferência das evidências.</w:t>
             </w:r>
           </w:p>
           <w:p>

</xml_diff>